<commit_message>
Deploying to gh-pages from @ Morrison-Lab/mds@ae4771835b396af2e0eded663d6e7d64fb075bb8 🚀
</commit_message>
<xml_diff>
--- a/linear-algebra-complex.docx
+++ b/linear-algebra-complex.docx
@@ -15,10 +15,10 @@
         <w:pStyle w:val="Date"/>
       </w:pPr>
       <w:r>
-        <w:t xml:space="preserve">Last modified: 2026-10-13 11:22:25 (PDT)</w:t>
+        <w:t xml:space="preserve">Last modified: 2026-10-13 14:29:41 (PDT)</w:t>
       </w:r>
     </w:p>
-    <w:bookmarkStart w:id="35" w:name="sec-complex-vectors-matrices"/>
+    <w:bookmarkStart w:id="37" w:name="sec-complex-vectors-matrices"/>
     <w:p>
       <w:pPr>
         <w:pStyle w:val="Heading2"/>
@@ -27,7 +27,7 @@
         <w:t xml:space="preserve">1 Complex vectors and matrices</w:t>
       </w:r>
     </w:p>
-    <w:bookmarkStart w:id="11" w:name="def-complex-vector"/>
+    <w:bookmarkStart w:id="10" w:name="def-complex-vector"/>
     <w:p>
       <w:pPr>
         <w:pStyle w:val="FirstParagraph"/>
@@ -210,141 +210,8 @@
         <w:t xml:space="preserve">.</w:t>
       </w:r>
     </w:p>
-    <w:p>
-      <w:pPr>
-        <w:pStyle w:val="BodyText"/>
-      </w:pPr>
-      <w:r>
-        <w:t xml:space="preserve">The</w:t>
-      </w:r>
-      <w:r>
-        <w:t xml:space="preserve"> </w:t>
-      </w:r>
-      <w:r>
-        <w:rPr>
-          <w:b/>
-          <w:bCs/>
-        </w:rPr>
-        <w:t xml:space="preserve">complex conjugate</w:t>
-      </w:r>
-      <w:r>
-        <w:t xml:space="preserve"> </w:t>
-      </w:r>
-      <w:r>
-        <w:t xml:space="preserve">of a complex vector or matrix</w:t>
-      </w:r>
-      <w:r>
-        <w:t xml:space="preserve"> </w:t>
-      </w:r>
-      <w:r>
-        <w:t xml:space="preserve">takes the</w:t>
-      </w:r>
-      <w:r>
-        <w:t xml:space="preserve"> </w:t>
-      </w:r>
-      <w:hyperlink r:id="rId10">
-        <w:r>
-          <w:rPr>
-            <w:rStyle w:val="Hyperlink"/>
-          </w:rPr>
-          <w:t xml:space="preserve">complex conjugate</w:t>
-        </w:r>
-      </w:hyperlink>
-      <w:r>
-        <w:t xml:space="preserve"> </w:t>
-      </w:r>
-      <w:r>
-        <w:t xml:space="preserve">of each entry:</w:t>
-      </w:r>
-      <w:r>
-        <w:t xml:space="preserve"> </w:t>
-      </w:r>
-      <m:oMath>
-        <m:r>
-          <m:rPr>
-            <m:sty m:val="p"/>
-          </m:rPr>
-          <m:t>(</m:t>
-        </m:r>
-        <m:bar>
-          <m:barPr>
-            <m:pos m:val="top"/>
-          </m:barPr>
-          <m:e>
-            <m:r>
-              <m:rPr>
-                <m:sty m:val="bi"/>
-              </m:rPr>
-              <m:t>A</m:t>
-            </m:r>
-          </m:e>
-        </m:bar>
-        <m:sSub>
-          <m:e>
-            <m:r>
-              <m:rPr>
-                <m:sty m:val="p"/>
-              </m:rPr>
-              <m:t>)</m:t>
-            </m:r>
-          </m:e>
-          <m:sub>
-            <m:r>
-              <m:t>j</m:t>
-            </m:r>
-            <m:r>
-              <m:t>k</m:t>
-            </m:r>
-          </m:sub>
-        </m:sSub>
-        <m:limUpp>
-          <m:e>
-            <m:r>
-              <m:rPr>
-                <m:sty m:val="p"/>
-              </m:rPr>
-              <m:t>=</m:t>
-            </m:r>
-          </m:e>
-          <m:lim>
-            <m:r>
-              <m:rPr>
-                <m:nor/>
-                <m:sty m:val="p"/>
-              </m:rPr>
-              <m:t>def</m:t>
-            </m:r>
-          </m:lim>
-        </m:limUpp>
-        <m:bar>
-          <m:barPr>
-            <m:pos m:val="top"/>
-          </m:barPr>
-          <m:e>
-            <m:sSub>
-              <m:e>
-                <m:r>
-                  <m:t>a</m:t>
-                </m:r>
-              </m:e>
-              <m:sub>
-                <m:r>
-                  <m:t>j</m:t>
-                </m:r>
-                <m:r>
-                  <m:t>k</m:t>
-                </m:r>
-              </m:sub>
-            </m:sSub>
-          </m:e>
-        </m:bar>
-      </m:oMath>
-      <w:r>
-        <w:t xml:space="preserve">.</w:t>
-      </w:r>
-    </w:p>
-    <w:bookmarkEnd w:id="11"/>
-    <w:bookmarkStart w:id="12" w:name="exm-complex-vector"/>
+    <w:bookmarkEnd w:id="10"/>
+    <w:bookmarkStart w:id="11" w:name="exm-complex-vector"/>
     <w:p>
       <w:pPr>
         <w:pStyle w:val="BodyText"/>
@@ -762,8 +629,8 @@
         <w:t xml:space="preserve">.</w:t>
       </w:r>
     </w:p>
-    <w:bookmarkEnd w:id="12"/>
-    <w:bookmarkStart w:id="13" w:name="def-conjugate-transpose"/>
+    <w:bookmarkEnd w:id="11"/>
+    <w:bookmarkStart w:id="13" w:name="def-complex-conjugate-matrix"/>
     <w:p>
       <w:pPr>
         <w:pStyle w:val="BodyText"/>
@@ -773,7 +640,152 @@
           <w:b/>
           <w:bCs/>
         </w:rPr>
-        <w:t xml:space="preserve">Definition 2 (Conjugate transpose (Hermitian adjoint, Hermitian conjugate, transjugate))</w:t>
+        <w:t xml:space="preserve">Definition 2 (Complex conjugate of a complex vector or matrix)</w:t>
+      </w:r>
+      <w:r>
+        <w:t xml:space="preserve"> </w:t>
+      </w:r>
+      <w:r>
+        <w:t xml:space="preserve">The</w:t>
+      </w:r>
+      <w:r>
+        <w:t xml:space="preserve"> </w:t>
+      </w:r>
+      <w:r>
+        <w:rPr>
+          <w:b/>
+          <w:bCs/>
+        </w:rPr>
+        <w:t xml:space="preserve">complex conjugate</w:t>
+      </w:r>
+      <w:r>
+        <w:t xml:space="preserve"> </w:t>
+      </w:r>
+      <w:r>
+        <w:t xml:space="preserve">of a complex vector or matrix</w:t>
+      </w:r>
+      <w:r>
+        <w:t xml:space="preserve"> </w:t>
+      </w:r>
+      <w:r>
+        <w:t xml:space="preserve">takes the</w:t>
+      </w:r>
+      <w:r>
+        <w:t xml:space="preserve"> </w:t>
+      </w:r>
+      <w:hyperlink r:id="rId12">
+        <w:r>
+          <w:rPr>
+            <w:rStyle w:val="Hyperlink"/>
+          </w:rPr>
+          <w:t xml:space="preserve">complex conjugate</w:t>
+        </w:r>
+      </w:hyperlink>
+      <w:r>
+        <w:t xml:space="preserve"> </w:t>
+      </w:r>
+      <w:r>
+        <w:t xml:space="preserve">of each entry:</w:t>
+      </w:r>
+      <w:r>
+        <w:t xml:space="preserve"> </w:t>
+      </w:r>
+      <m:oMath>
+        <m:r>
+          <m:rPr>
+            <m:sty m:val="p"/>
+          </m:rPr>
+          <m:t>(</m:t>
+        </m:r>
+        <m:bar>
+          <m:barPr>
+            <m:pos m:val="top"/>
+          </m:barPr>
+          <m:e>
+            <m:r>
+              <m:rPr>
+                <m:sty m:val="bi"/>
+              </m:rPr>
+              <m:t>A</m:t>
+            </m:r>
+          </m:e>
+        </m:bar>
+        <m:sSub>
+          <m:e>
+            <m:r>
+              <m:rPr>
+                <m:sty m:val="p"/>
+              </m:rPr>
+              <m:t>)</m:t>
+            </m:r>
+          </m:e>
+          <m:sub>
+            <m:r>
+              <m:t>j</m:t>
+            </m:r>
+            <m:r>
+              <m:t>k</m:t>
+            </m:r>
+          </m:sub>
+        </m:sSub>
+        <m:limUpp>
+          <m:e>
+            <m:r>
+              <m:rPr>
+                <m:sty m:val="p"/>
+              </m:rPr>
+              <m:t>=</m:t>
+            </m:r>
+          </m:e>
+          <m:lim>
+            <m:r>
+              <m:rPr>
+                <m:nor/>
+                <m:sty m:val="p"/>
+              </m:rPr>
+              <m:t>def</m:t>
+            </m:r>
+          </m:lim>
+        </m:limUpp>
+        <m:bar>
+          <m:barPr>
+            <m:pos m:val="top"/>
+          </m:barPr>
+          <m:e>
+            <m:sSub>
+              <m:e>
+                <m:r>
+                  <m:t>a</m:t>
+                </m:r>
+              </m:e>
+              <m:sub>
+                <m:r>
+                  <m:t>j</m:t>
+                </m:r>
+                <m:r>
+                  <m:t>k</m:t>
+                </m:r>
+              </m:sub>
+            </m:sSub>
+          </m:e>
+        </m:bar>
+      </m:oMath>
+      <w:r>
+        <w:t xml:space="preserve">.</w:t>
+      </w:r>
+    </w:p>
+    <w:bookmarkEnd w:id="13"/>
+    <w:bookmarkStart w:id="14" w:name="def-conjugate-transpose"/>
+    <w:p>
+      <w:pPr>
+        <w:pStyle w:val="BodyText"/>
+      </w:pPr>
+      <w:r>
+        <w:rPr>
+          <w:b/>
+          <w:bCs/>
+        </w:rPr>
+        <w:t xml:space="preserve">Definition 3 (Conjugate transpose (Hermitian adjoint, Hermitian conjugate, transjugate))</w:t>
       </w:r>
       <w:r>
         <w:t xml:space="preserve"> </w:t>
@@ -1164,196 +1176,11 @@
         </m:oMath>
       </m:oMathPara>
     </w:p>
+    <w:bookmarkEnd w:id="14"/>
+    <w:bookmarkStart w:id="15" w:name="rem-conjugate-transpose-notation"/>
     <w:p>
       <w:pPr>
         <w:pStyle w:val="FirstParagraph"/>
-      </w:pPr>
-      <w:r>
-        <w:t xml:space="preserve">The conjugate transpose of a column vector</w:t>
-      </w:r>
-      <w:r>
-        <w:t xml:space="preserve"> </w:t>
-      </w:r>
-      <m:oMath>
-        <m:acc>
-          <m:accPr>
-            <m:chr m:val="̃"/>
-          </m:accPr>
-          <m:e>
-            <m:r>
-              <m:t>z</m:t>
-            </m:r>
-          </m:e>
-        </m:acc>
-        <m:r>
-          <m:rPr>
-            <m:sty m:val="p"/>
-          </m:rPr>
-          <m:t>∈</m:t>
-        </m:r>
-        <m:sSup>
-          <m:e>
-            <m:r>
-              <m:rPr>
-                <m:scr m:val="double-struck"/>
-                <m:sty m:val="p"/>
-              </m:rPr>
-              <m:t>C</m:t>
-            </m:r>
-          </m:e>
-          <m:sup>
-            <m:r>
-              <m:t>p</m:t>
-            </m:r>
-          </m:sup>
-        </m:sSup>
-      </m:oMath>
-      <w:r>
-        <w:t xml:space="preserve"> </w:t>
-      </w:r>
-      <w:r>
-        <w:t xml:space="preserve">is the</w:t>
-      </w:r>
-      <w:r>
-        <w:t xml:space="preserve"> </w:t>
-      </w:r>
-      <m:oMath>
-        <m:r>
-          <m:t>1</m:t>
-        </m:r>
-        <m:r>
-          <m:rPr>
-            <m:sty m:val="p"/>
-          </m:rPr>
-          <m:t>×</m:t>
-        </m:r>
-        <m:r>
-          <m:t>p</m:t>
-        </m:r>
-      </m:oMath>
-      <w:r>
-        <w:t xml:space="preserve"> </w:t>
-      </w:r>
-      <w:r>
-        <w:t xml:space="preserve">row vector</w:t>
-      </w:r>
-      <w:r>
-        <w:t xml:space="preserve"> </w:t>
-      </w:r>
-      <m:oMath>
-        <m:sSup>
-          <m:e>
-            <m:acc>
-              <m:accPr>
-                <m:chr m:val="̃"/>
-              </m:accPr>
-              <m:e>
-                <m:r>
-                  <m:t>z</m:t>
-                </m:r>
-              </m:e>
-            </m:acc>
-          </m:e>
-          <m:sup>
-            <m:r>
-              <m:rPr>
-                <m:scr m:val="sans-serif"/>
-                <m:sty m:val="p"/>
-              </m:rPr>
-              <m:t>H</m:t>
-            </m:r>
-          </m:sup>
-        </m:sSup>
-        <m:r>
-          <m:rPr>
-            <m:sty m:val="p"/>
-          </m:rPr>
-          <m:t>=</m:t>
-        </m:r>
-        <m:r>
-          <m:rPr>
-            <m:sty m:val="p"/>
-          </m:rPr>
-          <m:t>[</m:t>
-        </m:r>
-        <m:bar>
-          <m:barPr>
-            <m:pos m:val="top"/>
-          </m:barPr>
-          <m:e>
-            <m:sSub>
-              <m:e>
-                <m:r>
-                  <m:t>z</m:t>
-                </m:r>
-              </m:e>
-              <m:sub>
-                <m:r>
-                  <m:t>1</m:t>
-                </m:r>
-              </m:sub>
-            </m:sSub>
-          </m:e>
-        </m:bar>
-        <m:r>
-          <m:rPr>
-            <m:sty m:val="p"/>
-          </m:rPr>
-          <m:t>,</m:t>
-        </m:r>
-        <m:r>
-          <m:t> </m:t>
-        </m:r>
-        <m:r>
-          <m:rPr>
-            <m:sty m:val="p"/>
-          </m:rPr>
-          <m:t>…</m:t>
-        </m:r>
-        <m:r>
-          <m:rPr>
-            <m:sty m:val="p"/>
-          </m:rPr>
-          <m:t>,</m:t>
-        </m:r>
-        <m:r>
-          <m:t> </m:t>
-        </m:r>
-        <m:bar>
-          <m:barPr>
-            <m:pos m:val="top"/>
-          </m:barPr>
-          <m:e>
-            <m:sSub>
-              <m:e>
-                <m:r>
-                  <m:t>z</m:t>
-                </m:r>
-              </m:e>
-              <m:sub>
-                <m:r>
-                  <m:t>p</m:t>
-                </m:r>
-              </m:sub>
-            </m:sSub>
-          </m:e>
-        </m:bar>
-        <m:r>
-          <m:rPr>
-            <m:sty m:val="p"/>
-          </m:rPr>
-          <m:t>]</m:t>
-        </m:r>
-      </m:oMath>
-      <w:r>
-        <w:t xml:space="preserve">.</w:t>
-      </w:r>
-    </w:p>
-    <w:bookmarkEnd w:id="13"/>
-    <w:bookmarkStart w:id="14" w:name="rem-conjugate-transpose-notation"/>
-    <w:p>
-      <w:pPr>
-        <w:pStyle w:val="BodyText"/>
       </w:pPr>
       <w:r>
         <w:rPr>
@@ -1643,8 +1470,8 @@
         <w:t xml:space="preserve">“adjoint.”</w:t>
       </w:r>
     </w:p>
-    <w:bookmarkEnd w:id="14"/>
-    <w:bookmarkStart w:id="15" w:name="exm-conjugate-transpose"/>
+    <w:bookmarkEnd w:id="15"/>
+    <w:bookmarkStart w:id="16" w:name="exm-conjugate-transpose"/>
     <w:p>
       <w:pPr>
         <w:pStyle w:val="BodyText"/>
@@ -2347,8 +2174,205 @@
         <w:t xml:space="preserve">.</w:t>
       </w:r>
     </w:p>
-    <w:bookmarkEnd w:id="15"/>
-    <w:bookmarkStart w:id="16" w:name="thm-hermitian-adjoint-properties"/>
+    <w:bookmarkEnd w:id="16"/>
+    <w:bookmarkStart w:id="17" w:name="rem-conjugate-transpose-vector"/>
+    <w:p>
+      <w:pPr>
+        <w:pStyle w:val="BodyText"/>
+      </w:pPr>
+      <w:r>
+        <w:rPr>
+          <w:i/>
+          <w:iCs/>
+        </w:rPr>
+        <w:t xml:space="preserve">Remark 2</w:t>
+      </w:r>
+      <w:r>
+        <w:t xml:space="preserve"> (Conjugate transpose of a complex vector). </w:t>
+      </w:r>
+      <w:r>
+        <w:t xml:space="preserve">The conjugate transpose of a column vector</w:t>
+      </w:r>
+      <w:r>
+        <w:t xml:space="preserve"> </w:t>
+      </w:r>
+      <m:oMath>
+        <m:acc>
+          <m:accPr>
+            <m:chr m:val="̃"/>
+          </m:accPr>
+          <m:e>
+            <m:r>
+              <m:t>z</m:t>
+            </m:r>
+          </m:e>
+        </m:acc>
+        <m:r>
+          <m:rPr>
+            <m:sty m:val="p"/>
+          </m:rPr>
+          <m:t>∈</m:t>
+        </m:r>
+        <m:sSup>
+          <m:e>
+            <m:r>
+              <m:rPr>
+                <m:scr m:val="double-struck"/>
+                <m:sty m:val="p"/>
+              </m:rPr>
+              <m:t>C</m:t>
+            </m:r>
+          </m:e>
+          <m:sup>
+            <m:r>
+              <m:t>p</m:t>
+            </m:r>
+          </m:sup>
+        </m:sSup>
+      </m:oMath>
+      <w:r>
+        <w:t xml:space="preserve"> </w:t>
+      </w:r>
+      <w:r>
+        <w:t xml:space="preserve">is the</w:t>
+      </w:r>
+      <w:r>
+        <w:t xml:space="preserve"> </w:t>
+      </w:r>
+      <m:oMath>
+        <m:r>
+          <m:t>1</m:t>
+        </m:r>
+        <m:r>
+          <m:rPr>
+            <m:sty m:val="p"/>
+          </m:rPr>
+          <m:t>×</m:t>
+        </m:r>
+        <m:r>
+          <m:t>p</m:t>
+        </m:r>
+      </m:oMath>
+      <w:r>
+        <w:t xml:space="preserve"> </w:t>
+      </w:r>
+      <w:r>
+        <w:t xml:space="preserve">row vector</w:t>
+      </w:r>
+      <w:r>
+        <w:t xml:space="preserve"> </w:t>
+      </w:r>
+      <m:oMath>
+        <m:sSup>
+          <m:e>
+            <m:acc>
+              <m:accPr>
+                <m:chr m:val="̃"/>
+              </m:accPr>
+              <m:e>
+                <m:r>
+                  <m:t>z</m:t>
+                </m:r>
+              </m:e>
+            </m:acc>
+          </m:e>
+          <m:sup>
+            <m:r>
+              <m:rPr>
+                <m:scr m:val="sans-serif"/>
+                <m:sty m:val="p"/>
+              </m:rPr>
+              <m:t>H</m:t>
+            </m:r>
+          </m:sup>
+        </m:sSup>
+        <m:r>
+          <m:rPr>
+            <m:sty m:val="p"/>
+          </m:rPr>
+          <m:t>=</m:t>
+        </m:r>
+        <m:r>
+          <m:rPr>
+            <m:sty m:val="p"/>
+          </m:rPr>
+          <m:t>[</m:t>
+        </m:r>
+        <m:bar>
+          <m:barPr>
+            <m:pos m:val="top"/>
+          </m:barPr>
+          <m:e>
+            <m:sSub>
+              <m:e>
+                <m:r>
+                  <m:t>z</m:t>
+                </m:r>
+              </m:e>
+              <m:sub>
+                <m:r>
+                  <m:t>1</m:t>
+                </m:r>
+              </m:sub>
+            </m:sSub>
+          </m:e>
+        </m:bar>
+        <m:r>
+          <m:rPr>
+            <m:sty m:val="p"/>
+          </m:rPr>
+          <m:t>,</m:t>
+        </m:r>
+        <m:r>
+          <m:t> </m:t>
+        </m:r>
+        <m:r>
+          <m:rPr>
+            <m:sty m:val="p"/>
+          </m:rPr>
+          <m:t>…</m:t>
+        </m:r>
+        <m:r>
+          <m:rPr>
+            <m:sty m:val="p"/>
+          </m:rPr>
+          <m:t>,</m:t>
+        </m:r>
+        <m:r>
+          <m:t> </m:t>
+        </m:r>
+        <m:bar>
+          <m:barPr>
+            <m:pos m:val="top"/>
+          </m:barPr>
+          <m:e>
+            <m:sSub>
+              <m:e>
+                <m:r>
+                  <m:t>z</m:t>
+                </m:r>
+              </m:e>
+              <m:sub>
+                <m:r>
+                  <m:t>p</m:t>
+                </m:r>
+              </m:sub>
+            </m:sSub>
+          </m:e>
+        </m:bar>
+        <m:r>
+          <m:rPr>
+            <m:sty m:val="p"/>
+          </m:rPr>
+          <m:t>]</m:t>
+        </m:r>
+      </m:oMath>
+      <w:r>
+        <w:t xml:space="preserve">.</w:t>
+      </w:r>
+    </w:p>
+    <w:bookmarkEnd w:id="17"/>
+    <w:bookmarkStart w:id="18" w:name="thm-hermitian-adjoint-properties"/>
     <w:p>
       <w:pPr>
         <w:pStyle w:val="BodyText"/>
@@ -2444,7 +2468,7 @@
           <w:rPr>
             <w:rStyle w:val="Hyperlink"/>
           </w:rPr>
-          <w:t xml:space="preserve">Definition 2</w:t>
+          <w:t xml:space="preserve">Definition 3</w:t>
         </w:r>
       </w:hyperlink>
       <w:r>
@@ -3051,7 +3075,7 @@
         </m:oMath>
       </m:oMathPara>
     </w:p>
-    <w:bookmarkEnd w:id="16"/>
+    <w:bookmarkEnd w:id="18"/>
     <w:p>
       <w:pPr>
         <w:pStyle w:val="FirstParagraph"/>
@@ -4435,7 +4459,7 @@
                   <m:nor/>
                   <m:sty m:val="p"/>
                 </m:rPr>
-                <m:t>Definition 2</m:t>
+                <m:t>Definition 3</m:t>
               </m:r>
               <m:r>
                 <m:rPr>
@@ -4884,7 +4908,7 @@
                   <m:nor/>
                   <m:sty m:val="p"/>
                 </m:rPr>
-                <m:t>Definition 2</m:t>
+                <m:t>Definition 3</m:t>
               </m:r>
               <m:r>
                 <m:rPr>
@@ -5357,7 +5381,7 @@
         <w:t xml:space="preserve">.</w:t>
       </w:r>
     </w:p>
-    <w:bookmarkStart w:id="17" w:name="thm-adjoint-inner-product"/>
+    <w:bookmarkStart w:id="19" w:name="thm-adjoint-inner-product"/>
     <w:p>
       <w:pPr>
         <w:pStyle w:val="BodyText"/>
@@ -5720,7 +5744,7 @@
         </m:oMath>
       </m:oMathPara>
     </w:p>
-    <w:bookmarkEnd w:id="17"/>
+    <w:bookmarkEnd w:id="19"/>
     <w:p>
       <w:pPr>
         <w:pStyle w:val="FirstParagraph"/>
@@ -6156,7 +6180,7 @@
         </m:oMath>
       </m:oMathPara>
     </w:p>
-    <w:bookmarkStart w:id="18" w:name="rem-adjoint-name"/>
+    <w:bookmarkStart w:id="20" w:name="rem-adjoint-name"/>
     <w:p>
       <w:pPr>
         <w:pStyle w:val="FirstParagraph"/>
@@ -6166,7 +6190,7 @@
           <w:i/>
           <w:iCs/>
         </w:rPr>
-        <w:t xml:space="preserve">Remark 2</w:t>
+        <w:t xml:space="preserve">Remark 3</w:t>
       </w:r>
       <w:r>
         <w:t xml:space="preserve"> (Where the name</w:t>
@@ -6519,8 +6543,8 @@
         <w:t xml:space="preserve">).</w:t>
       </w:r>
     </w:p>
-    <w:bookmarkEnd w:id="18"/>
-    <w:bookmarkStart w:id="19" w:name="thm-zhz-sum-squares"/>
+    <w:bookmarkEnd w:id="20"/>
+    <w:bookmarkStart w:id="21" w:name="thm-zhz-sum-squares"/>
     <w:p>
       <w:pPr>
         <w:pStyle w:val="BodyText"/>
@@ -6894,7 +6918,7 @@
         <w:t xml:space="preserve">.</w:t>
       </w:r>
     </w:p>
-    <w:bookmarkEnd w:id="19"/>
+    <w:bookmarkEnd w:id="21"/>
     <w:p>
       <w:pPr>
         <w:pStyle w:val="BodyText"/>
@@ -6915,7 +6939,7 @@
       <w:r>
         <w:t xml:space="preserve"> </w:t>
       </w:r>
-      <w:hyperlink r:id="rId20">
+      <w:hyperlink r:id="rId22">
         <w:r>
           <w:rPr>
             <w:rStyle w:val="Hyperlink"/>
@@ -7061,7 +7085,7 @@
                   <m:nor/>
                   <m:sty m:val="p"/>
                 </m:rPr>
-                <m:t>Definition 2</m:t>
+                <m:t>Definition 3</m:t>
               </m:r>
               <m:r>
                 <m:rPr>
@@ -7262,7 +7286,7 @@
       <w:r>
         <w:t xml:space="preserve"> </w:t>
       </w:r>
-      <w:hyperlink r:id="rId21">
+      <w:hyperlink r:id="rId23">
         <w:r>
           <w:rPr>
             <w:rStyle w:val="Hyperlink"/>
@@ -7636,7 +7660,7 @@
         <w:t xml:space="preserve">.</w:t>
       </w:r>
     </w:p>
-    <w:bookmarkStart w:id="22" w:name="exm-zhz-sum-squares"/>
+    <w:bookmarkStart w:id="24" w:name="exm-zhz-sum-squares"/>
     <w:p>
       <w:pPr>
         <w:pStyle w:val="BodyText"/>
@@ -8556,8 +8580,8 @@
         </m:oMath>
       </m:oMathPara>
     </w:p>
-    <w:bookmarkEnd w:id="22"/>
-    <w:bookmarkStart w:id="23" w:name="exm-transpose-not-enough"/>
+    <w:bookmarkEnd w:id="24"/>
+    <w:bookmarkStart w:id="25" w:name="exm-transpose-not-enough"/>
     <w:p>
       <w:pPr>
         <w:pStyle w:val="FirstParagraph"/>
@@ -9309,7 +9333,7 @@
                   <m:nor/>
                   <m:sty m:val="p"/>
                 </m:rPr>
-                <m:t>Definition 2</m:t>
+                <m:t>Definition 3</m:t>
               </m:r>
               <m:r>
                 <m:rPr>
@@ -9517,8 +9541,8 @@
         <w:t xml:space="preserve">guarantees.</w:t>
       </w:r>
     </w:p>
-    <w:bookmarkEnd w:id="23"/>
-    <w:bookmarkStart w:id="24" w:name="def-hermitian-matrix"/>
+    <w:bookmarkEnd w:id="25"/>
+    <w:bookmarkStart w:id="26" w:name="def-hermitian-matrix"/>
     <w:p>
       <w:pPr>
         <w:pStyle w:val="BodyText"/>
@@ -9528,7 +9552,7 @@
           <w:b/>
           <w:bCs/>
         </w:rPr>
-        <w:t xml:space="preserve">Definition 3 (Hermitian matrix (self-adjoint matrix))</w:t>
+        <w:t xml:space="preserve">Definition 4 (Hermitian matrix (self-adjoint matrix))</w:t>
       </w:r>
       <w:r>
         <w:t xml:space="preserve"> </w:t>
@@ -9624,7 +9648,7 @@
           <w:rPr>
             <w:rStyle w:val="Hyperlink"/>
           </w:rPr>
-          <w:t xml:space="preserve">Definition 2</w:t>
+          <w:t xml:space="preserve">Definition 3</w:t>
         </w:r>
       </w:hyperlink>
       <w:r>
@@ -9680,8 +9704,8 @@
         </m:oMath>
       </m:oMathPara>
     </w:p>
-    <w:bookmarkEnd w:id="24"/>
-    <w:bookmarkStart w:id="25" w:name="rem-hermitian-self-adjoint"/>
+    <w:bookmarkEnd w:id="26"/>
+    <w:bookmarkStart w:id="27" w:name="rem-hermitian-self-adjoint"/>
     <w:p>
       <w:pPr>
         <w:pStyle w:val="FirstParagraph"/>
@@ -9691,7 +9715,7 @@
           <w:i/>
           <w:iCs/>
         </w:rPr>
-        <w:t xml:space="preserve">Remark 3</w:t>
+        <w:t xml:space="preserve">Remark 4</w:t>
       </w:r>
       <w:r>
         <w:t xml:space="preserve"> (Why</w:t>
@@ -9925,8 +9949,8 @@
         <w:t xml:space="preserve">The linear operator moves across the inner product without change.</w:t>
       </w:r>
     </w:p>
-    <w:bookmarkEnd w:id="25"/>
-    <w:bookmarkStart w:id="26" w:name="exm-hermitian-matrix"/>
+    <w:bookmarkEnd w:id="27"/>
+    <w:bookmarkStart w:id="28" w:name="exm-hermitian-matrix"/>
     <w:p>
       <w:pPr>
         <w:pStyle w:val="BodyText"/>
@@ -10455,8 +10479,8 @@
         <w:t xml:space="preserve">.</w:t>
       </w:r>
     </w:p>
-    <w:bookmarkEnd w:id="26"/>
-    <w:bookmarkStart w:id="27" w:name="exm-not-hermitian"/>
+    <w:bookmarkEnd w:id="28"/>
+    <w:bookmarkStart w:id="29" w:name="exm-not-hermitian"/>
     <w:p>
       <w:pPr>
         <w:pStyle w:val="BodyText"/>
@@ -10780,8 +10804,8 @@
         </m:oMath>
       </m:oMathPara>
     </w:p>
-    <w:bookmarkEnd w:id="27"/>
-    <w:bookmarkStart w:id="28" w:name="def-skew-hermitian-matrix"/>
+    <w:bookmarkEnd w:id="29"/>
+    <w:bookmarkStart w:id="30" w:name="def-skew-hermitian-matrix"/>
     <w:p>
       <w:pPr>
         <w:pStyle w:val="FirstParagraph"/>
@@ -10791,7 +10815,7 @@
           <w:b/>
           <w:bCs/>
         </w:rPr>
-        <w:t xml:space="preserve">Definition 4 (Skew-Hermitian matrix (anti-Hermitian matrix))</w:t>
+        <w:t xml:space="preserve">Definition 5 (Skew-Hermitian matrix (anti-Hermitian matrix))</w:t>
       </w:r>
       <w:r>
         <w:t xml:space="preserve"> </w:t>
@@ -10887,7 +10911,7 @@
           <w:rPr>
             <w:rStyle w:val="Hyperlink"/>
           </w:rPr>
-          <w:t xml:space="preserve">Definition 2</w:t>
+          <w:t xml:space="preserve">Definition 3</w:t>
         </w:r>
       </w:hyperlink>
       <w:r>
@@ -10949,8 +10973,8 @@
         </m:oMath>
       </m:oMathPara>
     </w:p>
-    <w:bookmarkEnd w:id="28"/>
-    <w:bookmarkStart w:id="29" w:name="rem-skew-hermitian-diagonal"/>
+    <w:bookmarkEnd w:id="30"/>
+    <w:bookmarkStart w:id="31" w:name="rem-skew-hermitian-diagonal"/>
     <w:p>
       <w:pPr>
         <w:pStyle w:val="FirstParagraph"/>
@@ -10960,7 +10984,7 @@
           <w:i/>
           <w:iCs/>
         </w:rPr>
-        <w:t xml:space="preserve">Remark 4</w:t>
+        <w:t xml:space="preserve">Remark 5</w:t>
       </w:r>
       <w:r>
         <w:t xml:space="preserve"> (The diagonal of a skew-Hermitian matrix). </w:t>
@@ -11462,8 +11486,8 @@
         <w:t xml:space="preserve">.</w:t>
       </w:r>
     </w:p>
-    <w:bookmarkEnd w:id="29"/>
-    <w:bookmarkStart w:id="30" w:name="exm-skew-hermitian-matrix"/>
+    <w:bookmarkEnd w:id="31"/>
+    <w:bookmarkStart w:id="32" w:name="exm-skew-hermitian-matrix"/>
     <w:p>
       <w:pPr>
         <w:pStyle w:val="BodyText"/>
@@ -11932,8 +11956,8 @@
         <w:t xml:space="preserve">are purely imaginary.</w:t>
       </w:r>
     </w:p>
-    <w:bookmarkEnd w:id="30"/>
-    <w:bookmarkStart w:id="31" w:name="X4e376dfe4195dd67571b7cde9ab8c2999dabc4a"/>
+    <w:bookmarkEnd w:id="32"/>
+    <w:bookmarkStart w:id="33" w:name="X4e376dfe4195dd67571b7cde9ab8c2999dabc4a"/>
     <w:p>
       <w:pPr>
         <w:pStyle w:val="BodyText"/>
@@ -12021,7 +12045,7 @@
           <w:rPr>
             <w:rStyle w:val="Hyperlink"/>
           </w:rPr>
-          <w:t xml:space="preserve">Definition 3</w:t>
+          <w:t xml:space="preserve">Definition 4</w:t>
         </w:r>
       </w:hyperlink>
       <w:r>
@@ -12055,7 +12079,7 @@
           <w:rPr>
             <w:rStyle w:val="Hyperlink"/>
           </w:rPr>
-          <w:t xml:space="preserve">Definition 4</w:t>
+          <w:t xml:space="preserve">Definition 5</w:t>
         </w:r>
       </w:hyperlink>
       <w:r>
@@ -12259,7 +12283,7 @@
         </m:oMath>
       </m:oMathPara>
     </w:p>
-    <w:bookmarkEnd w:id="31"/>
+    <w:bookmarkEnd w:id="33"/>
     <w:p>
       <w:pPr>
         <w:pStyle w:val="FirstParagraph"/>
@@ -14332,8 +14356,8 @@
         </m:oMath>
       </m:oMathPara>
     </w:p>
-    <w:bookmarkStart w:id="34" w:name="refs"/>
-    <w:bookmarkStart w:id="33" w:name="ref-axler2024linear"/>
+    <w:bookmarkStart w:id="36" w:name="refs"/>
+    <w:bookmarkStart w:id="35" w:name="ref-axler2024linear"/>
     <w:p>
       <w:pPr>
         <w:pStyle w:val="Bibliography"/>
@@ -14357,7 +14381,7 @@
       <w:r>
         <w:t xml:space="preserve"> </w:t>
       </w:r>
-      <w:hyperlink r:id="rId32">
+      <w:hyperlink r:id="rId34">
         <w:r>
           <w:rPr>
             <w:rStyle w:val="Hyperlink"/>
@@ -14369,9 +14393,9 @@
         <w:t xml:space="preserve">.</w:t>
       </w:r>
     </w:p>
-    <w:bookmarkEnd w:id="33"/>
-    <w:bookmarkEnd w:id="34"/>
     <w:bookmarkEnd w:id="35"/>
+    <w:bookmarkEnd w:id="36"/>
+    <w:bookmarkEnd w:id="37"/>
     <w:sectPr>
       <w:footnotePr>
         <w:numRestart w:val="eachSect"/>

</xml_diff>